<commit_message>
Sửa mẫu thông báo ngừng phù hiệu
</commit_message>
<xml_diff>
--- a/public/thong_bao_ngung_phu_hieu_ha_noi_template.docx
+++ b/public/thong_bao_ngung_phu_hieu_ha_noi_template.docx
@@ -50,7 +50,7 @@
                 <w:szCs w:val="25"/>
                 <w:lang w:val="nl-NL"/>
               </w:rPr>
-              <w:t>CÔNG TY CỔ PHẦN VẬN TẢI</w:t>
+              <w:t>{ten_don_vi_upper}</w:t>
             </w:r>
           </w:p>
           <w:p>
@@ -75,7 +75,7 @@
                 <w:szCs w:val="25"/>
                 <w:lang w:val="nl-NL"/>
               </w:rPr>
-              <w:t>HOÀNG MINH DŨNG</w:t>
+              <w:t/>
             </w:r>
           </w:p>
         </w:tc>
@@ -817,33 +817,11 @@
             </w:pPr>
             <w:r>
               <w:rPr>
-                <w:sz w:val="2"/>
-                <w:szCs w:val="2"/>
-              </w:rPr>
-              <w:t>{#danh_sach_</w:t>
-            </w:r>
-            <w:proofErr w:type="gramStart"/>
-            <w:r>
-              <w:rPr>
-                <w:sz w:val="2"/>
-                <w:szCs w:val="2"/>
-              </w:rPr>
-              <w:t>xe}</w:t>
-            </w:r>
-            <w:r>
-              <w:rPr>
-                <w:sz w:val="26"/>
-                <w:szCs w:val="26"/>
-              </w:rPr>
-              <w:t>{</w:t>
-            </w:r>
-            <w:proofErr w:type="gramEnd"/>
-            <w:r>
-              <w:rPr>
-                <w:sz w:val="26"/>
-                <w:szCs w:val="26"/>
-              </w:rPr>
-              <w:t>stt}</w:t>
+                <w:rFonts w:ascii="Times New Roman" w:hAnsi="Times New Roman" w:cs="Times New Roman"/>
+                <w:sz w:val="26"/>
+                <w:szCs w:val="26"/>
+              </w:rPr>
+              <w:t>{#danh_sach_xe}{stt}</w:t>
             </w:r>
           </w:p>
         </w:tc>
@@ -866,6 +844,7 @@
             </w:pPr>
             <w:r>
               <w:rPr>
+                <w:rFonts w:ascii="Times New Roman" w:hAnsi="Times New Roman" w:cs="Times New Roman"/>
                 <w:sz w:val="26"/>
                 <w:szCs w:val="26"/>
               </w:rPr>
@@ -896,24 +875,11 @@
             </w:pPr>
             <w:r>
               <w:rPr>
-                <w:sz w:val="26"/>
-                <w:szCs w:val="26"/>
-              </w:rPr>
-              <w:t>{so</w:t>
-            </w:r>
-            <w:r>
-              <w:rPr>
-                <w:sz w:val="2"/>
-                <w:szCs w:val="2"/>
-              </w:rPr>
-              <w:t>_phu</w:t>
-            </w:r>
-            <w:r>
-              <w:rPr>
-                <w:sz w:val="26"/>
-                <w:szCs w:val="26"/>
-              </w:rPr>
-              <w:t>_hieu}</w:t>
+                <w:rFonts w:ascii="Times New Roman" w:hAnsi="Times New Roman" w:cs="Times New Roman"/>
+                <w:sz w:val="26"/>
+                <w:szCs w:val="26"/>
+              </w:rPr>
+              <w:t>{so_phu_hieu}</w:t>
             </w:r>
           </w:p>
         </w:tc>
@@ -940,6 +906,7 @@
             </w:pPr>
             <w:r>
               <w:rPr>
+                <w:rFonts w:ascii="Times New Roman" w:hAnsi="Times New Roman" w:cs="Times New Roman"/>
                 <w:sz w:val="26"/>
                 <w:szCs w:val="26"/>
               </w:rPr>
@@ -970,6 +937,7 @@
             </w:pPr>
             <w:r>
               <w:rPr>
+                <w:rFonts w:ascii="Times New Roman" w:hAnsi="Times New Roman" w:cs="Times New Roman"/>
                 <w:sz w:val="26"/>
                 <w:szCs w:val="26"/>
               </w:rPr>
@@ -1000,33 +968,11 @@
             </w:pPr>
             <w:r>
               <w:rPr>
-                <w:sz w:val="26"/>
-                <w:szCs w:val="26"/>
-              </w:rPr>
-              <w:t>{ly_</w:t>
-            </w:r>
-            <w:proofErr w:type="gramStart"/>
-            <w:r>
-              <w:rPr>
-                <w:sz w:val="26"/>
-                <w:szCs w:val="26"/>
-              </w:rPr>
-              <w:t>do</w:t>
-            </w:r>
-            <w:r>
-              <w:rPr>
-                <w:sz w:val="2"/>
-                <w:szCs w:val="2"/>
-              </w:rPr>
-              <w:t>}{</w:t>
-            </w:r>
-            <w:proofErr w:type="gramEnd"/>
-            <w:r>
-              <w:rPr>
-                <w:sz w:val="2"/>
-                <w:szCs w:val="2"/>
-              </w:rPr>
-              <w:t>/danh_sach_xe}</w:t>
+                <w:rFonts w:ascii="Times New Roman" w:hAnsi="Times New Roman" w:cs="Times New Roman"/>
+                <w:sz w:val="26"/>
+                <w:szCs w:val="26"/>
+              </w:rPr>
+              <w:t>{ly_do}{/danh_sach_xe}</w:t>
             </w:r>
           </w:p>
         </w:tc>
@@ -1410,19 +1356,12 @@
         </w:rPr>
       </w:pPr>
       <w:r>
-        <w:t xml:space="preserve">      </w:t>
-      </w:r>
-      <w:r>
-        <w:rPr>
-          <w:i/>
-        </w:rPr>
-        <w:t xml:space="preserve">Ngày…… tháng…… năm </w:t>
-      </w:r>
-      <w:r>
-        <w:rPr>
-          <w:i/>
-        </w:rPr>
-        <w:t>………</w:t>
+        <w:rPr>
+          <w:rFonts w:ascii="Times New Roman" w:hAnsi="Times New Roman" w:cs="Times New Roman"/>
+          <w:sz w:val="26"/>
+          <w:szCs w:val="26"/>
+        </w:rPr>
+        <w:t xml:space="preserve">      Ngày {ngay_thong_bao_day} tháng {ngay_thong_bao_month} năm {ngay_thong_bao_year}</w:t>
       </w:r>
     </w:p>
     <w:sectPr>

</xml_diff>